<commit_message>
Finish and verify the kit fixes from the double-check
Each kit's fixes were re-tested by an independent verifier (all passed):
- cra-readiness: make_sbom.py no longer crashes with a relative --out on
  Node projects; examples write to the ignored clients/ folder.
- model-retirement: --from-raw re-applies grades without calling the
  paid API again; template placeholders are caught before any call.
- doc-accessibility, publisher-rescue: build scripts honour --help
  instead of overwriting files; the report states the real crawl delay;
  the sample delivery note names the substituted font.
- redcap-xlsform, replication-package: correct minimum Python versions;
  relative --python paths work; client folders are git-ignored.
- All kits: prices marked as estimates, how to put your name on the
  sample, the kit's own Python in skill commands, and other polish.

Co-Authored-By: Claude Opus 5.5 <noreply@anthropic.com>
Claude-Session: https://claude.ai/code/session_01DspfyLwNfeJ4CHdyACeRHQ
</commit_message>
<xml_diff>
--- a/kits/doc-accessibility/samples/report/fernwick-document-snapshot.docx
+++ b/kits/doc-accessibility/samples/report/fernwick-document-snapshot.docx
@@ -20,7 +20,7 @@
     </w:p>
     <w:p>
       <w:r>
-        <w:t>Website: http://127.0.0.1:8765/</w:t>
+        <w:t>Website: https://www.fernwick.example/</w:t>
       </w:r>
     </w:p>
     <w:p>
@@ -38,7 +38,7 @@
     </w:p>
     <w:p>
       <w:r>
-        <w:t>We found 14 documents (27 pages) linked from 9 pages of http://127.0.0.1:8765/. 9 of the 11 PDFs have no tags, so people using screen readers cannot move through their headings, lists or tables, and 1 is a scan with no real text. 3 files need fixing first because people use them to apply for a service or they are linked from your home page. We suggest fixing or converting 11 files and archiving or deleting 2 more, which you decide with your ADA coordinator.</w:t>
+        <w:t>We found 14 documents (27 pages) linked from 9 pages of https://www.fernwick.example/. 9 of the 11 PDFs have no tags, so people using screen readers cannot move through their headings, lists or tables, and 1 is a scan with no real text. 3 files need fixing first because people use them to apply for a service or they are linked from your home page. We suggest fixing or converting 11 files and archiving or deleting 2 more, which you decide with your ADA coordinator.</w:t>
       </w:r>
     </w:p>
     <w:p>
@@ -963,7 +963,7 @@
         <w:pStyle w:val="ListBullet"/>
       </w:pPr>
       <w:r>
-        <w:t>It lists the documents we could reach by following links from http://127.0.0.1:8765/, up to 3 clicks deep, on 7 October 2026. Files behind logins, inside search tools or loaded by scripts may be missing.</w:t>
+        <w:t>It lists the documents we could reach by following links from https://www.fernwick.example/, up to 3 clicks deep, on 7 October 2026. Files behind logins, inside search tools or loaded by scripts may be missing.</w:t>
       </w:r>
     </w:p>
     <w:p>
@@ -1032,7 +1032,7 @@
     </w:p>
     <w:p>
       <w:r>
-        <w:t>We read 9 web pages on 7 October 2026, following your site's robots.txt rules and leaving at least one second between requests. For each file we checked tags, real text versus scanned images, title, language, form fields, bookmarks and security settings, using open-source tools.</w:t>
+        <w:t>We read 9 web pages on 7 October 2026, following your site's robots.txt rules and leaving at least 0.2 seconds between requests. For each file we checked tags, real text versus scanned images, title, language, form fields, bookmarks and security settings, using open-source tools.</w:t>
       </w:r>
     </w:p>
     <w:p>

</xml_diff>